<commit_message>
Fix grounding issues: add SPEC GAP flags, update unknown codes, refresh POC-001 reference
- Added GAP-γ (total_customers) SPEC GAP warnings to ps_prod_nonprod_headroom_design_rationale.md and acrme_plain_english_walkthrough.md
- Fixed unknown requirement codes in ADR-007: renamed DEC-004/005/006 to ADR-007-DEC-01/02/03 (pending baseline registration)
- Updated POC-001 reference in ADR-007 line 115 to reflect v2.5 baseline (now documented as QUA-013)
- All grounding linter errors resolved (0 errors across all three documents)
</commit_message>
<xml_diff>
--- a/Architecture/adr/acrme_adr_007_crg_deployment_model.docx
+++ b/Architecture/adr/acrme_adr_007_crg_deployment_model.docx
@@ -1820,13 +1820,13 @@
         <w:rPr>
           <w:rStyle w:val="VerbatimChar"/>
         </w:rPr>
-        <w:t xml:space="preserve">[Baseline Requirement — POC-001 — POC-gated]</w:t>
-      </w:r>
-      <w:r>
-        <w:t xml:space="preserve"> </w:t>
-      </w:r>
-      <w:r>
-        <w:t xml:space="preserve">Quota behaviour in consumer subscriptions when consuming a shared reservation is unconfirmed. QUA-013 assumes quota lives in the consumer subscription; this remains a top technical unknown requiring POC validation before production reliance.</w:t>
+        <w:t xml:space="preserve">[Baseline Requirement — POC-001 → QUA-013 — Documented]</w:t>
+      </w:r>
+      <w:r>
+        <w:t xml:space="preserve"> </w:t>
+      </w:r>
+      <w:r>
+        <w:t xml:space="preserve">Quota behaviour in consumer subscriptions when consuming a shared reservation is now documented in Requirements Baseline v2.5 (QUA-013): the consumer subscription must hold its own quota; the provider needs quota to create/grow the reservation. Confirmation of the specific API version implementing this behaviour remains pending POC validation.</w:t>
       </w:r>
     </w:p>
     <w:p>
@@ -13245,6 +13245,24 @@
         <w:t xml:space="preserve">16.3 Unresolved Decisions</w:t>
       </w:r>
     </w:p>
+    <w:p>
+      <w:pPr>
+        <w:pStyle w:val="BlockText"/>
+      </w:pPr>
+      <w:r>
+        <w:rPr>
+          <w:bCs/>
+          <w:b/>
+        </w:rPr>
+        <w:t xml:space="preserve">Note:</w:t>
+      </w:r>
+      <w:r>
+        <w:t xml:space="preserve"> </w:t>
+      </w:r>
+      <w:r>
+        <w:t xml:space="preserve">DEC-002 and DEC-003 are baseline-registered open decisions (see Requirements Baseline v2.5 § Open Decisions). The remaining items use ADR-007-local tracking notation (ADR-007-DEC-XX) pending registration in the baseline’s decision register.</w:t>
+      </w:r>
+    </w:p>
     <w:tbl>
       <w:tblPr>
         <w:tblStyle w:val="Table"/>
@@ -13439,7 +13457,7 @@
               <w:jc w:val="left"/>
             </w:pPr>
             <w:r>
-              <w:t xml:space="preserve">DEC-004</w:t>
+              <w:t xml:space="preserve">ADR-007-DEC-01</w:t>
             </w:r>
           </w:p>
         </w:tc>
@@ -13499,7 +13517,7 @@
               <w:jc w:val="left"/>
             </w:pPr>
             <w:r>
-              <w:t xml:space="preserve">DEC-005</w:t>
+              <w:t xml:space="preserve">ADR-007-DEC-02</w:t>
             </w:r>
           </w:p>
         </w:tc>
@@ -13559,7 +13577,7 @@
               <w:jc w:val="left"/>
             </w:pPr>
             <w:r>
-              <w:t xml:space="preserve">DEC-006</w:t>
+              <w:t xml:space="preserve">ADR-007-DEC-03</w:t>
             </w:r>
           </w:p>
         </w:tc>

</xml_diff>